<commit_message>
Harden multi-tenant attendance and refresh UI
</commit_message>
<xml_diff>
--- a/mobile/docs/ASTEM-Attendance-User-Manual.docx
+++ b/mobile/docs/ASTEM-Attendance-User-Manual.docx
@@ -1,20 +1,20 @@
 
 <file path=docProps\app.xml><?xml version="1.0" encoding="utf-8"?>
 <Properties xmlns="http://schemas.openxmlformats.org/officeDocument/2006/extended-properties" xmlns:vt="http://schemas.openxmlformats.org/officeDocument/2006/docPropsVTypes">
-  <Application>ASTEM Attendance Register</Application>
+  <Application>M'Salem Attendance Register</Application>
   <DocSecurity>0</DocSecurity>
   <ScaleCrop>false</ScaleCrop>
-  <Company>ASTEM</Company>
+  <Company>M'Salem</Company>
 </Properties>
 </file>
 
 <file path=docProps\core.xml><?xml version="1.0" encoding="utf-8"?>
 <cp:coreProperties xmlns:cp="http://schemas.openxmlformats.org/package/2006/metadata/core-properties" xmlns:dc="http://purl.org/dc/elements/1.1/" xmlns:dcterms="http://purl.org/dc/terms/" xmlns:dcmitype="http://purl.org/dc/dcmitype/" xmlns:xsi="http://www.w3.org/2001/XMLSchema-instance">
-  <dc:title>ASTEM Attendance Register User Manual</dc:title>
-  <dc:creator>ASTEM Attendance Register</dc:creator>
-  <cp:lastModifiedBy>ASTEM Attendance Register</cp:lastModifiedBy>
-  <dcterms:created xsi:type="dcterms:W3CDTF">2026-05-20T22:17:20.075Z</dcterms:created>
-  <dcterms:modified xsi:type="dcterms:W3CDTF">2026-05-20T22:17:20.075Z</dcterms:modified>
+  <dc:title>M'Salem Attendance Register User Manual</dc:title>
+  <dc:creator>M'Salem Attendance Register</dc:creator>
+  <cp:lastModifiedBy>M'Salem Attendance Register</cp:lastModifiedBy>
+  <dcterms:created xsi:type="dcterms:W3CDTF">2026-06-28T17:08:50.245Z</dcterms:created>
+  <dcterms:modified xsi:type="dcterms:W3CDTF">2026-06-28T17:08:50.245Z</dcterms:modified>
 </cp:coreProperties>
 </file>
 
@@ -26,7 +26,7 @@
         <w:pStyle w:val="Title"/>
       </w:pPr>
       <w:r>
-        <w:t>ASTEM Attendance Register: User Manual</w:t>
+        <w:t>M'Salem Attendance Register: User Manual</w:t>
       </w:r>
     </w:p>
     <w:p>
@@ -48,7 +48,7 @@
         <w:pStyle w:val="Normal"/>
       </w:pPr>
       <w:r>
-        <w:t>Version 1.2 Expanded Edition</w:t>
+        <w:t>Version 1.3 Updated Edition</w:t>
       </w:r>
     </w:p>
     <w:p/>
@@ -76,7 +76,7 @@
         <w:pStyle w:val="Normal"/>
       </w:pPr>
       <w:r>
-        <w:t>ASTEM uses a simple colour language throughout the app and this manual.</w:t>
+        <w:t>M'Salem uses a simple colour language throughout the app and this manual.</w:t>
       </w:r>
     </w:p>
     <w:p/>
@@ -406,7 +406,7 @@
         <w:keepNext/>
       </w:pPr>
       <w:r>
-        <w:t>1. Welcome To ASTEM Attendance Register</w:t>
+        <w:t>1. Welcome To M'Salem Attendance Register</w:t>
       </w:r>
     </w:p>
     <w:p/>
@@ -415,7 +415,7 @@
         <w:pStyle w:val="Normal"/>
       </w:pPr>
       <w:r>
-        <w:t>ASTEM Attendance Register is an all-in-one school attendance system designed to make attendance fast, secure, traceable, and easy to report. It supports student attendance, staff attendance, parent visibility, reports, user approvals, QR cards, biometrics, face recognition, school location protection, and administrative setup.</w:t>
+        <w:t>M'Salem Attendance Register is an all-in-one school attendance system designed to make attendance fast, secure, traceable, and easy to report. It supports student attendance, staff attendance, parent visibility, reports, user approvals, QR cards, biometrics, face recognition, school location protection, and administrative setup.</w:t>
       </w:r>
     </w:p>
     <w:p/>
@@ -525,7 +525,7 @@
         <w:pStyle w:val="CodeBlock"/>
       </w:pPr>
       <w:r>
-        <w:t xml:space="preserve">                 ASTEM ATTENDANCE REGISTER</w:t>
+        <w:t xml:space="preserve">                 M'SALEM ATTENDANCE REGISTER</w:t>
       </w:r>
     </w:p>
     <w:p>
@@ -1698,7 +1698,7 @@
               <w:pStyle w:val="TableText"/>
             </w:pPr>
             <w:r>
-              <w:t>Opens reports for administrators</w:t>
+              <w:t>Opens daily, weekly, monthly, termly, yearly, and individual reports for administrators</w:t>
             </w:r>
           </w:p>
         </w:tc>
@@ -1913,7 +1913,7 @@
         <w:pStyle w:val="CodeBlock"/>
       </w:pPr>
       <w:r>
-        <w:t xml:space="preserve">          |-- Reports -&gt; Daily / weekly / monthly / termly</w:t>
+        <w:t xml:space="preserve">          |-- Reports -&gt; Daily / weekly / monthly / termly / yearly</w:t>
       </w:r>
     </w:p>
     <w:p/>
@@ -2088,7 +2088,16 @@
         <w:ind w:left="720" w:hanging="360"/>
       </w:pPr>
       <w:r>
-        <w:t>3. Wait for the success confirmation before moving to the next student.</w:t>
+        <w:t>3. Add a movement-book reason if the app asks for one because the check-in is very late or the check-out is early.</w:t>
+      </w:r>
+    </w:p>
+    <w:p>
+      <w:pPr>
+        <w:pStyle w:val="ListParagraph"/>
+        <w:ind w:left="720" w:hanging="360"/>
+      </w:pPr>
+      <w:r>
+        <w:t>4. Wait for the success confirmation before moving to the next student.</w:t>
       </w:r>
     </w:p>
     <w:p/>
@@ -2252,16 +2261,25 @@
         <w:ind w:left="720" w:hanging="360"/>
       </w:pPr>
       <w:r>
-        <w:t>2. Follow the on-screen prompt.</w:t>
-      </w:r>
-    </w:p>
-    <w:p>
-      <w:pPr>
-        <w:pStyle w:val="ListParagraph"/>
-        <w:ind w:left="720" w:hanging="360"/>
-      </w:pPr>
-      <w:r>
-        <w:t>3. Confirm that the success message appears.</w:t>
+        <w:t>2. Add a movement-book reason if the app asks for one because the check-in is very late or the check-out is early.</w:t>
+      </w:r>
+    </w:p>
+    <w:p>
+      <w:pPr>
+        <w:pStyle w:val="ListParagraph"/>
+        <w:ind w:left="720" w:hanging="360"/>
+      </w:pPr>
+      <w:r>
+        <w:t>3. Follow the on-screen prompt.</w:t>
+      </w:r>
+    </w:p>
+    <w:p>
+      <w:pPr>
+        <w:pStyle w:val="ListParagraph"/>
+        <w:ind w:left="720" w:hanging="360"/>
+      </w:pPr>
+      <w:r>
+        <w:t>4. Confirm that the success message appears.</w:t>
       </w:r>
     </w:p>
     <w:p/>
@@ -2447,6 +2465,15 @@
         <w:t>- Staff self-service and assigned-class-only attendance are blocked while geofencing is bypassed.</w:t>
       </w:r>
     </w:p>
+    <w:p>
+      <w:pPr>
+        <w:pStyle w:val="ListParagraph"/>
+        <w:ind w:left="720" w:hanging="360"/>
+      </w:pPr>
+      <w:r>
+        <w:t>- A movement-book reason is required for very late check-ins and early check-outs when the configured policy requires it.</w:t>
+      </w:r>
+    </w:p>
     <w:p/>
     <w:p>
       <w:pPr>
@@ -2546,40 +2573,49 @@
         <w:t>Scan Student QR</w:t>
       </w:r>
       <w:r>
+        <w:t xml:space="preserve">, </w:t>
+      </w:r>
+      <w:r>
+        <w:rPr>
+          <w:b/>
+        </w:rPr>
+        <w:t>Scan Staff QR</w:t>
+      </w:r>
+      <w:r>
+        <w:t xml:space="preserve">, or </w:t>
+      </w:r>
+      <w:r>
+        <w:rPr>
+          <w:b/>
+        </w:rPr>
+        <w:t>Scan Your Staff QR</w:t>
+      </w:r>
+      <w:r>
+        <w:t>.</w:t>
+      </w:r>
+    </w:p>
+    <w:p/>
+    <w:p>
+      <w:pPr>
+        <w:pStyle w:val="ListParagraph"/>
+        <w:ind w:left="720" w:hanging="360"/>
+      </w:pPr>
+      <w:r>
+        <w:t xml:space="preserve">- Tap </w:t>
+      </w:r>
+      <w:r>
+        <w:rPr>
+          <w:b/>
+        </w:rPr>
+        <w:t>Check-in</w:t>
+      </w:r>
+      <w:r>
         <w:t xml:space="preserve"> or </w:t>
       </w:r>
       <w:r>
         <w:rPr>
           <w:b/>
         </w:rPr>
-        <w:t>Scan Staff QR</w:t>
-      </w:r>
-      <w:r>
-        <w:t>.</w:t>
-      </w:r>
-    </w:p>
-    <w:p/>
-    <w:p>
-      <w:pPr>
-        <w:pStyle w:val="ListParagraph"/>
-        <w:ind w:left="720" w:hanging="360"/>
-      </w:pPr>
-      <w:r>
-        <w:t xml:space="preserve">- Tap </w:t>
-      </w:r>
-      <w:r>
-        <w:rPr>
-          <w:b/>
-        </w:rPr>
-        <w:t>Check-in</w:t>
-      </w:r>
-      <w:r>
-        <w:t xml:space="preserve"> or </w:t>
-      </w:r>
-      <w:r>
-        <w:rPr>
-          <w:b/>
-        </w:rPr>
         <w:t>Check-out</w:t>
       </w:r>
       <w:r>
@@ -2592,7 +2628,43 @@
         <w:ind w:left="720" w:hanging="360"/>
       </w:pPr>
       <w:r>
-        <w:t>- Point the camera at the QR card.</w:t>
+        <w:t>- Point the camera at the QR card generated by the mobile or web QR card tools.</w:t>
+      </w:r>
+    </w:p>
+    <w:p>
+      <w:pPr>
+        <w:pStyle w:val="ListParagraph"/>
+        <w:ind w:left="720" w:hanging="360"/>
+      </w:pPr>
+      <w:r>
+        <w:t xml:space="preserve">- The web check-in page uses camera scanning only; the old manual </w:t>
+      </w:r>
+      <w:r>
+        <w:rPr>
+          <w:b/>
+        </w:rPr>
+        <w:t>QR Code Payload</w:t>
+      </w:r>
+      <w:r>
+        <w:t xml:space="preserve"> paste box has been removed.</w:t>
+      </w:r>
+    </w:p>
+    <w:p>
+      <w:pPr>
+        <w:pStyle w:val="ListParagraph"/>
+        <w:ind w:left="720" w:hanging="360"/>
+      </w:pPr>
+      <w:r>
+        <w:t>- Signed staff QR codes are validated before staff attendance is recorded.</w:t>
+      </w:r>
+    </w:p>
+    <w:p>
+      <w:pPr>
+        <w:pStyle w:val="ListParagraph"/>
+        <w:ind w:left="720" w:hanging="360"/>
+      </w:pPr>
+      <w:r>
+        <w:t>- If a very late check-in or early check-out requires a reason, choose or type the movement-book reason before saving.</w:t>
       </w:r>
     </w:p>
     <w:p>
@@ -2610,7 +2682,7 @@
         <w:t>Scan Again</w:t>
       </w:r>
       <w:r>
-        <w:t xml:space="preserve"> for the next person.</w:t>
+        <w:t xml:space="preserve"> for the next person where available.</w:t>
       </w:r>
     </w:p>
     <w:p>
@@ -2998,7 +3070,7 @@
               <w:pStyle w:val="TableText"/>
             </w:pPr>
             <w:r>
-              <w:t>Generates staff QR cards</w:t>
+              <w:t>Generates professional printable staff QR cards and PDF/print output</w:t>
             </w:r>
           </w:p>
         </w:tc>
@@ -3110,7 +3182,7 @@
               <w:pStyle w:val="TableText"/>
             </w:pPr>
             <w:r>
-              <w:t>Sets late time, close time, and timezone</w:t>
+              <w:t>Sets late time, close time, timezone, weekend/holiday policy, and triggers absent auto-marking</w:t>
             </w:r>
           </w:p>
         </w:tc>
@@ -4517,7 +4589,7 @@
         <w:rPr>
           <w:b/>
         </w:rPr>
-        <w:t>Copy JSON</w:t>
+        <w:t>Share PNG</w:t>
       </w:r>
       <w:r>
         <w:t xml:space="preserve"> or </w:t>
@@ -4526,10 +4598,10 @@
         <w:rPr>
           <w:b/>
         </w:rPr>
-        <w:t>Share PNG</w:t>
-      </w:r>
-      <w:r>
-        <w:t xml:space="preserve"> for a digital copy.</w:t>
+        <w:t>Export PDF</w:t>
+      </w:r>
+      <w:r>
+        <w:t xml:space="preserve"> for a digital or printable copy.</w:t>
       </w:r>
     </w:p>
     <w:p>
@@ -4977,6 +5049,98 @@
       </w:pPr>
       <w:r>
         <w:t>4. Confirm the staff card shows the correct enrollment status.</w:t>
+      </w:r>
+    </w:p>
+    <w:p/>
+    <w:p>
+      <w:pPr>
+        <w:pStyle w:val="Heading2"/>
+        <w:keepNext/>
+      </w:pPr>
+      <w:r>
+        <w:t>Staff QR Cards</w:t>
+      </w:r>
+    </w:p>
+    <w:p/>
+    <w:p>
+      <w:pPr>
+        <w:pStyle w:val="Normal"/>
+      </w:pPr>
+      <w:r>
+        <w:t xml:space="preserve">Go to </w:t>
+      </w:r>
+      <w:r>
+        <w:rPr>
+          <w:b/>
+        </w:rPr>
+        <w:t>Admin &gt; Staff QR Cards</w:t>
+      </w:r>
+      <w:r>
+        <w:t xml:space="preserve"> or </w:t>
+      </w:r>
+      <w:r>
+        <w:rPr>
+          <w:b/>
+        </w:rPr>
+        <w:t>Attendance &gt; Staff QR Generator</w:t>
+      </w:r>
+      <w:r>
+        <w:t>.</w:t>
+      </w:r>
+    </w:p>
+    <w:p/>
+    <w:p>
+      <w:pPr>
+        <w:pStyle w:val="ListParagraph"/>
+        <w:ind w:left="720" w:hanging="360"/>
+      </w:pPr>
+      <w:r>
+        <w:t>- Search staff by name, staff ID, email, or role.</w:t>
+      </w:r>
+    </w:p>
+    <w:p>
+      <w:pPr>
+        <w:pStyle w:val="ListParagraph"/>
+        <w:ind w:left="720" w:hanging="360"/>
+      </w:pPr>
+      <w:r>
+        <w:t>- Generate QR cards using the signed professional QR payload used by the mobile app.</w:t>
+      </w:r>
+    </w:p>
+    <w:p>
+      <w:pPr>
+        <w:pStyle w:val="ListParagraph"/>
+        <w:ind w:left="720" w:hanging="360"/>
+      </w:pPr>
+      <w:r>
+        <w:t xml:space="preserve">- Use </w:t>
+      </w:r>
+      <w:r>
+        <w:rPr>
+          <w:b/>
+        </w:rPr>
+        <w:t>Print / PDF</w:t>
+      </w:r>
+      <w:r>
+        <w:t xml:space="preserve"> or </w:t>
+      </w:r>
+      <w:r>
+        <w:rPr>
+          <w:b/>
+        </w:rPr>
+        <w:t>Export PDF</w:t>
+      </w:r>
+      <w:r>
+        <w:t xml:space="preserve"> to print staff cards.</w:t>
+      </w:r>
+    </w:p>
+    <w:p>
+      <w:pPr>
+        <w:pStyle w:val="ListParagraph"/>
+        <w:ind w:left="720" w:hanging="360"/>
+      </w:pPr>
+      <w:r>
+        <w:t>- The card preview focuses on the QR image and staff identity. Raw payload text is no longer shown to ordinary check-in users.</w:t>
       </w:r>
     </w:p>
     <w:p/>
@@ -5785,7 +5949,7 @@
               <w:pStyle w:val="TableText"/>
             </w:pPr>
             <w:r>
-              <w:t>After this time, new check-ins are blocked</w:t>
+              <w:t>After this time, new check-ins are blocked and early check-out policy is calculated</w:t>
             </w:r>
           </w:p>
         </w:tc>
@@ -7246,6 +7410,34 @@
               <w:pStyle w:val="TableText"/>
             </w:pPr>
             <w:r>
+              <w:t>Yearly Reports</w:t>
+            </w:r>
+          </w:p>
+        </w:tc>
+        <w:tc>
+          <w:tcPr>
+            <w:tcW w:w="3000" w:type="dxa"/>
+          </w:tcPr>
+          <w:p>
+            <w:pPr>
+              <w:pStyle w:val="TableText"/>
+            </w:pPr>
+            <w:r>
+              <w:t>Review a full academic/calendar year</w:t>
+            </w:r>
+          </w:p>
+        </w:tc>
+      </w:tr>
+      <w:tr>
+        <w:tc>
+          <w:tcPr>
+            <w:tcW w:w="3000" w:type="dxa"/>
+          </w:tcPr>
+          <w:p>
+            <w:pPr>
+              <w:pStyle w:val="TableText"/>
+            </w:pPr>
+            <w:r>
               <w:t>Individual Student Report</w:t>
             </w:r>
           </w:p>
@@ -7493,7 +7685,7 @@
               <w:pStyle w:val="TableText"/>
             </w:pPr>
             <w:r>
-              <w:t>Attendance rate for the selected period</w:t>
+              <w:t>Attended sessions divided by attended plus absent sessions</w:t>
             </w:r>
           </w:p>
         </w:tc>
@@ -7548,7 +7740,7 @@
         <w:pStyle w:val="CodeBlock"/>
       </w:pPr>
       <w:r>
-        <w:t>Choose daily / weekly / monthly / termly</w:t>
+        <w:t>Choose daily / weekly / monthly / termly / yearly</w:t>
       </w:r>
     </w:p>
     <w:p>
@@ -7564,7 +7756,7 @@
         <w:pStyle w:val="CodeBlock"/>
       </w:pPr>
       <w:r>
-        <w:t>Filter by date, class, or person</w:t>
+        <w:t>Filter by date, class, term, year, or person</w:t>
       </w:r>
     </w:p>
     <w:p>
@@ -7580,7 +7772,7 @@
         <w:pStyle w:val="CodeBlock"/>
       </w:pPr>
       <w:r>
-        <w:t>Review summary</w:t>
+        <w:t>Review summary cards: Present, Late, Attended, Absent, Attendance %</w:t>
       </w:r>
     </w:p>
     <w:p>
@@ -7596,11 +7788,271 @@
         <w:pStyle w:val="CodeBlock"/>
       </w:pPr>
       <w:r>
-        <w:t>Export PDF if needed</w:t>
-      </w:r>
-    </w:p>
-    <w:p/>
-    <w:p/>
+        <w:t>Print / PDF or export PDF if needed</w:t>
+      </w:r>
+    </w:p>
+    <w:p/>
+    <w:p/>
+    <w:p>
+      <w:pPr>
+        <w:pStyle w:val="Heading2"/>
+        <w:keepNext/>
+      </w:pPr>
+      <w:r>
+        <w:t>Attendance Totals And Auto-Marked Absence</w:t>
+      </w:r>
+    </w:p>
+    <w:p/>
+    <w:p>
+      <w:pPr>
+        <w:pStyle w:val="Normal"/>
+      </w:pPr>
+      <w:r>
+        <w:t>Recent report pages show total cards above the report table:</w:t>
+      </w:r>
+    </w:p>
+    <w:p/>
+    <w:tbl>
+      <w:tblPr>
+        <w:tblStyle w:val="TableGrid"/>
+        <w:tblW w:w="0" w:type="auto"/>
+        <w:tblBorders>
+          <w:top w:val="single" w:sz="6" w:space="0" w:color="CBD5E1"/>
+          <w:left w:val="single" w:sz="6" w:space="0" w:color="CBD5E1"/>
+          <w:bottom w:val="single" w:sz="6" w:space="0" w:color="CBD5E1"/>
+          <w:right w:val="single" w:sz="6" w:space="0" w:color="CBD5E1"/>
+          <w:insideH w:val="single" w:sz="6" w:space="0" w:color="CBD5E1"/>
+          <w:insideV w:val="single" w:sz="6" w:space="0" w:color="CBD5E1"/>
+        </w:tblBorders>
+      </w:tblPr>
+      <w:tblGrid>
+        <w:gridCol w:w="3000"/>
+        <w:gridCol w:w="3000"/>
+      </w:tblGrid>
+      <w:tr>
+        <w:tc>
+          <w:tcPr>
+            <w:tcW w:w="3000" w:type="dxa"/>
+            <w:shd w:fill="DDEBFF"/>
+          </w:tcPr>
+          <w:p>
+            <w:pPr>
+              <w:pStyle w:val="TableText"/>
+            </w:pPr>
+            <w:r>
+              <w:rPr>
+                <w:b/>
+              </w:rPr>
+              <w:t>Card</w:t>
+            </w:r>
+          </w:p>
+        </w:tc>
+        <w:tc>
+          <w:tcPr>
+            <w:tcW w:w="3000" w:type="dxa"/>
+            <w:shd w:fill="DDEBFF"/>
+          </w:tcPr>
+          <w:p>
+            <w:pPr>
+              <w:pStyle w:val="TableText"/>
+            </w:pPr>
+            <w:r>
+              <w:rPr>
+                <w:b/>
+              </w:rPr>
+              <w:t>Meaning</w:t>
+            </w:r>
+          </w:p>
+        </w:tc>
+      </w:tr>
+      <w:tr>
+        <w:tc>
+          <w:tcPr>
+            <w:tcW w:w="3000" w:type="dxa"/>
+          </w:tcPr>
+          <w:p>
+            <w:pPr>
+              <w:pStyle w:val="TableText"/>
+            </w:pPr>
+            <w:r>
+              <w:t>Present</w:t>
+            </w:r>
+          </w:p>
+        </w:tc>
+        <w:tc>
+          <w:tcPr>
+            <w:tcW w:w="3000" w:type="dxa"/>
+          </w:tcPr>
+          <w:p>
+            <w:pPr>
+              <w:pStyle w:val="TableText"/>
+            </w:pPr>
+            <w:r>
+              <w:t>People checked in before the late time</w:t>
+            </w:r>
+          </w:p>
+        </w:tc>
+      </w:tr>
+      <w:tr>
+        <w:tc>
+          <w:tcPr>
+            <w:tcW w:w="3000" w:type="dxa"/>
+          </w:tcPr>
+          <w:p>
+            <w:pPr>
+              <w:pStyle w:val="TableText"/>
+            </w:pPr>
+            <w:r>
+              <w:t>Late</w:t>
+            </w:r>
+          </w:p>
+        </w:tc>
+        <w:tc>
+          <w:tcPr>
+            <w:tcW w:w="3000" w:type="dxa"/>
+          </w:tcPr>
+          <w:p>
+            <w:pPr>
+              <w:pStyle w:val="TableText"/>
+            </w:pPr>
+            <w:r>
+              <w:t>People checked in after the late time</w:t>
+            </w:r>
+          </w:p>
+        </w:tc>
+      </w:tr>
+      <w:tr>
+        <w:tc>
+          <w:tcPr>
+            <w:tcW w:w="3000" w:type="dxa"/>
+          </w:tcPr>
+          <w:p>
+            <w:pPr>
+              <w:pStyle w:val="TableText"/>
+            </w:pPr>
+            <w:r>
+              <w:t>Attended</w:t>
+            </w:r>
+          </w:p>
+        </w:tc>
+        <w:tc>
+          <w:tcPr>
+            <w:tcW w:w="3000" w:type="dxa"/>
+          </w:tcPr>
+          <w:p>
+            <w:pPr>
+              <w:pStyle w:val="TableText"/>
+            </w:pPr>
+            <w:r>
+              <w:t>Present plus Late</w:t>
+            </w:r>
+          </w:p>
+        </w:tc>
+      </w:tr>
+      <w:tr>
+        <w:tc>
+          <w:tcPr>
+            <w:tcW w:w="3000" w:type="dxa"/>
+          </w:tcPr>
+          <w:p>
+            <w:pPr>
+              <w:pStyle w:val="TableText"/>
+            </w:pPr>
+            <w:r>
+              <w:t>Absent</w:t>
+            </w:r>
+          </w:p>
+        </w:tc>
+        <w:tc>
+          <w:tcPr>
+            <w:tcW w:w="3000" w:type="dxa"/>
+          </w:tcPr>
+          <w:p>
+            <w:pPr>
+              <w:pStyle w:val="TableText"/>
+            </w:pPr>
+            <w:r>
+              <w:t>People auto-marked or recorded as absent for the selected period</w:t>
+            </w:r>
+          </w:p>
+        </w:tc>
+      </w:tr>
+      <w:tr>
+        <w:tc>
+          <w:tcPr>
+            <w:tcW w:w="3000" w:type="dxa"/>
+          </w:tcPr>
+          <w:p>
+            <w:pPr>
+              <w:pStyle w:val="TableText"/>
+            </w:pPr>
+            <w:r>
+              <w:t>Attendance %</w:t>
+            </w:r>
+          </w:p>
+        </w:tc>
+        <w:tc>
+          <w:tcPr>
+            <w:tcW w:w="3000" w:type="dxa"/>
+          </w:tcPr>
+          <w:p>
+            <w:pPr>
+              <w:pStyle w:val="TableText"/>
+            </w:pPr>
+            <w:r>
+              <w:t>Attended divided by Attended plus Absent</w:t>
+            </w:r>
+          </w:p>
+        </w:tc>
+      </w:tr>
+    </w:tbl>
+    <w:p/>
+    <w:p/>
+    <w:p>
+      <w:pPr>
+        <w:pStyle w:val="Normal"/>
+      </w:pPr>
+      <w:r>
+        <w:t>Daily reports automatically run the absence marking check for the selected day before showing the summary. Weekly, monthly, termly, yearly, and individual reports use the recorded attendance and absent records in the selected date range. If no absence records exist yet for a person or period, the Absent value remains 0 and the percentage is calculated from the records available.</w:t>
+      </w:r>
+    </w:p>
+    <w:p/>
+    <w:p>
+      <w:pPr>
+        <w:pStyle w:val="Heading2"/>
+        <w:keepNext/>
+      </w:pPr>
+      <w:r>
+        <w:t>Printing Reports</w:t>
+      </w:r>
+    </w:p>
+    <w:p/>
+    <w:p>
+      <w:pPr>
+        <w:pStyle w:val="Normal"/>
+      </w:pPr>
+      <w:r>
+        <w:t xml:space="preserve">Use </w:t>
+      </w:r>
+      <w:r>
+        <w:rPr>
+          <w:b/>
+        </w:rPr>
+        <w:t>Print / PDF</w:t>
+      </w:r>
+      <w:r>
+        <w:t xml:space="preserve"> or </w:t>
+      </w:r>
+      <w:r>
+        <w:rPr>
+          <w:b/>
+        </w:rPr>
+        <w:t>Export PDF</w:t>
+      </w:r>
+      <w:r>
+        <w:t xml:space="preserve"> from report pages to create a printable report. The print view contains the selected filters, totals, and report rows without the normal app navigation.</w:t>
+      </w:r>
+    </w:p>
     <w:p>
       <w:pPr>
         <w:pStyle w:val="Heading1"/>
@@ -8199,20 +8651,20 @@
               <w:pStyle w:val="TableText"/>
             </w:pPr>
             <w:r>
-              <w:t>QR is wrong, damaged, or mismatched</w:t>
-            </w:r>
-          </w:p>
-        </w:tc>
-        <w:tc>
-          <w:tcPr>
-            <w:tcW w:w="3000" w:type="dxa"/>
-          </w:tcPr>
-          <w:p>
-            <w:pPr>
-              <w:pStyle w:val="TableText"/>
-            </w:pPr>
-            <w:r>
-              <w:t>Confirm QR belongs to the right student/staff and class</w:t>
+              <w:t>QR is wrong, damaged, mismatched, or not from the app card generator</w:t>
+            </w:r>
+          </w:p>
+        </w:tc>
+        <w:tc>
+          <w:tcPr>
+            <w:tcW w:w="3000" w:type="dxa"/>
+          </w:tcPr>
+          <w:p>
+            <w:pPr>
+              <w:pStyle w:val="TableText"/>
+            </w:pPr>
+            <w:r>
+              <w:t>Confirm QR belongs to the right student/staff and class, then regenerate the card if needed</w:t>
             </w:r>
           </w:p>
         </w:tc>
@@ -8604,7 +9056,7 @@
               <w:pStyle w:val="TableText"/>
             </w:pPr>
             <w:r>
-              <w:t>Student/Staff Attendance, QR Scanner, Today's Attendance, Staff ID, Face Check-In</w:t>
+              <w:t>Student/Staff Attendance, QR Scanner, Today's Attendance, Staff ID, Face Check-In, Staff QR Generator, Movement Reasons</w:t>
             </w:r>
           </w:p>
         </w:tc>
@@ -8772,13 +9224,12 @@
               <w:pStyle w:val="TableText"/>
             </w:pPr>
             <w:r>
-              <w:t>Daily, Weekly, Monthly, Termly, Student Detail, Staff Detail</w:t>
+              <w:t>Daily, Weekly, Monthly, Termly, Yearly, Student Detail, Staff Detail, Staff Yearly</w:t>
             </w:r>
           </w:p>
         </w:tc>
       </w:tr>
     </w:tbl>
-    <w:p/>
     <w:p/>
     <w:p/>
     <w:sectPr>

</xml_diff>